<commit_message>
Apply the 2012 Reinach citations to the .docx version too
Same 17 footnote changes as in the .odt (see REINACH_CITATIONS.md);
only word/footnotes.xml changed, all other parts are byte-identical.

Co-Authored-By: Claude Opus 5.5 <noreply@anthropic.com>
Claude-Session: https://claude.ai/code/session_01HwpdXEQxyPwsBFSDD8s1fQ
</commit_message>
<xml_diff>
--- a/SA_VALIDORDERS_Version_2.docx
+++ b/SA_VALIDORDERS_Version_2.docx
@@ -6934,7 +6934,7 @@
         <w:rPr>
           <w:lang w:val="en-US"/>
         </w:rPr>
-        <w:t xml:space="preserve"> Reinach (year), p.163</w:t>
+        <w:t xml:space="preserve"> Reinach (2012), p.23, p.31</w:t>
       </w:r>
     </w:p>
   </w:footnote>
@@ -7272,7 +7272,7 @@
         <w:footnoteRef/>
       </w:r>
       <w:r>
-        <w:t xml:space="preserve"> Reinach, FINDPAGE</w:t>
+        <w:t xml:space="preserve"> Reinach (2012), p.12</w:t>
       </w:r>
     </w:p>
   </w:footnote>
@@ -7288,7 +7288,7 @@
         <w:footnoteRef/>
       </w:r>
       <w:r>
-        <w:t xml:space="preserve"> Reinach (1989), S.158</w:t>
+        <w:t xml:space="preserve"> Reinach (2012), p.18</w:t>
       </w:r>
     </w:p>
   </w:footnote>
@@ -7332,7 +7332,7 @@
         <w:rPr>
           <w:lang w:val="en-US"/>
         </w:rPr>
-        <w:t xml:space="preserve"> Ibid</w:t>
+        <w:t xml:space="preserve"> Ibid, p.19f</w:t>
       </w:r>
     </w:p>
   </w:footnote>
@@ -7354,7 +7354,7 @@
         <w:rPr>
           <w:lang w:val="en-US"/>
         </w:rPr>
-        <w:t xml:space="preserve"> Ibid, p.147</w:t>
+        <w:t xml:space="preserve"> Ibid, p.8f</w:t>
       </w:r>
     </w:p>
   </w:footnote>
@@ -7376,7 +7376,7 @@
         <w:rPr>
           <w:lang w:val="en-US"/>
         </w:rPr>
-        <w:t xml:space="preserve"> Ibid, ajah</w:t>
+        <w:t xml:space="preserve"> Ibid, p.22</w:t>
       </w:r>
     </w:p>
   </w:footnote>
@@ -7398,7 +7398,7 @@
         <w:rPr>
           <w:lang w:val="en-US"/>
         </w:rPr>
-        <w:t xml:space="preserve"> Ibid, jahah</w:t>
+        <w:t xml:space="preserve"> Ibid, p.22f</w:t>
       </w:r>
     </w:p>
   </w:footnote>
@@ -7460,7 +7460,7 @@
         <w:rPr>
           <w:lang w:val="es-ES"/>
         </w:rPr>
-        <w:t xml:space="preserve"> Reinach (1989), p.52</w:t>
+        <w:t xml:space="preserve"> Reinach (2012), p.81</w:t>
       </w:r>
     </w:p>
   </w:footnote>
@@ -7482,7 +7482,7 @@
         <w:rPr>
           <w:lang w:val="es-ES"/>
         </w:rPr>
-        <w:t xml:space="preserve"> Ibid</w:t>
+        <w:t xml:space="preserve"> Ibid, p.66</w:t>
       </w:r>
     </w:p>
   </w:footnote>
@@ -7504,7 +7504,7 @@
         <w:rPr>
           <w:lang w:val="es-ES"/>
         </w:rPr>
-        <w:t xml:space="preserve"> Ibid., p.20</w:t>
+        <w:t xml:space="preserve"> Ibid., p.23, p.31</w:t>
       </w:r>
     </w:p>
   </w:footnote>
@@ -7526,7 +7526,7 @@
         <w:rPr>
           <w:lang w:val="en-US"/>
         </w:rPr>
-        <w:t xml:space="preserve"> Ibid., p.68</w:t>
+        <w:t xml:space="preserve"> Ibid., p.111</w:t>
       </w:r>
     </w:p>
   </w:footnote>
@@ -7548,7 +7548,7 @@
         <w:rPr>
           <w:lang w:val="en-US"/>
         </w:rPr>
-        <w:t xml:space="preserve"> Ibid., p.20</w:t>
+        <w:t xml:space="preserve"> Ibid., p.31</w:t>
       </w:r>
     </w:p>
   </w:footnote>
@@ -7624,7 +7624,7 @@
         <w:footnoteRef/>
       </w:r>
       <w:r>
-        <w:t xml:space="preserve"> Reinach (1989), p.20</w:t>
+        <w:t xml:space="preserve"> Reinach (2012), p.31</w:t>
       </w:r>
     </w:p>
   </w:footnote>
@@ -7656,7 +7656,7 @@
         <w:footnoteRef/>
       </w:r>
       <w:r>
-        <w:t xml:space="preserve"> See: Reinach (1989), Chrudzimski (2015), Miller (1987)</w:t>
+        <w:t xml:space="preserve"> See: Reinach (2012), Chrudzimski (2015), Miller (1987)</w:t>
       </w:r>
     </w:p>
   </w:footnote>
@@ -7672,7 +7672,7 @@
         <w:footnoteRef/>
       </w:r>
       <w:r>
-        <w:t xml:space="preserve"> Reinach (1989), p.6ff</w:t>
+        <w:t xml:space="preserve"> Reinach (2012), p.11f</w:t>
       </w:r>
     </w:p>
   </w:footnote>
@@ -7704,7 +7704,7 @@
         <w:footnoteRef/>
       </w:r>
       <w:r>
-        <w:t xml:space="preserve"> Reinach (1989), p.11</w:t>
+        <w:t xml:space="preserve"> Reinach (2012), p.10, p.23</w:t>
       </w:r>
     </w:p>
   </w:footnote>
@@ -7736,7 +7736,7 @@
         <w:footnoteRef/>
       </w:r>
       <w:r>
-        <w:t xml:space="preserve"> See: Reinach (2012), p.22ff, Miller (1989), p.122</w:t>
+        <w:t xml:space="preserve"> See: Reinach (2012), p.82ff, Miller (1989), p.122</w:t>
       </w:r>
     </w:p>
   </w:footnote>

</xml_diff>